<commit_message>
Atualização no relatório e ajustes no README
</commit_message>
<xml_diff>
--- a/readmeProjetoRefatorado.docx
+++ b/readmeProjetoRefatorado.docx
@@ -329,21 +329,7 @@
           <w:sz w:val="32"/>
           <w:szCs w:val="32"/>
         </w:rPr>
-        <w:t xml:space="preserve"># </w:t>
-      </w:r>
-      <w:r>
-        <w:rPr>
-          <w:sz w:val="32"/>
-          <w:szCs w:val="32"/>
-        </w:rPr>
-        <w:t>Testes rápidos no método</w:t>
-      </w:r>
-      <w:r>
-        <w:rPr>
-          <w:sz w:val="32"/>
-          <w:szCs w:val="32"/>
-        </w:rPr>
-        <w:t xml:space="preserve"> Main()</w:t>
+        <w:t># Testes rápidos no método Main()</w:t>
       </w:r>
     </w:p>
     <w:p>
@@ -353,13 +339,7 @@
     </w:p>
     <w:p>
       <w:r>
-        <w:t>um teste simples no método</w:t>
-      </w:r>
-      <w:r>
-        <w:t xml:space="preserve"> Main() </w:t>
-      </w:r>
-      <w:r>
-        <w:t>de uma classe auxiliar. O objetivo foi conferir se</w:t>
+        <w:t>um teste simples no método Main() de uma classe auxiliar. O objetivo foi conferir se</w:t>
       </w:r>
     </w:p>
     <w:p>
@@ -378,6 +358,9 @@
     </w:p>
     <w:p>
       <w:r>
+        <w:rPr>
+          <w:noProof/>
+        </w:rPr>
         <w:drawing>
           <wp:inline distT="0" distB="0" distL="0" distR="0" wp14:anchorId="4836EE04" wp14:editId="7E55DE46">
             <wp:extent cx="6906589" cy="3029373"/>
@@ -425,6 +408,9 @@
     </w:p>
     <w:p>
       <w:r>
+        <w:rPr>
+          <w:noProof/>
+        </w:rPr>
         <w:drawing>
           <wp:inline distT="0" distB="0" distL="0" distR="0" wp14:anchorId="74EEEAFD" wp14:editId="0CB9ECA4">
             <wp:extent cx="4334480" cy="1695687"/>
@@ -485,6 +471,97 @@
     </w:p>
     <w:p/>
     <w:p>
+      <w:r>
+        <w:rPr>
+          <w:sz w:val="32"/>
+          <w:szCs w:val="32"/>
+        </w:rPr>
+        <w:t>#Evidências do GitHub</w:t>
+      </w:r>
+      <w:r>
+        <w:br/>
+      </w:r>
+      <w:r>
+        <w:drawing>
+          <wp:inline distT="0" distB="0" distL="0" distR="0" wp14:anchorId="07BC14B1" wp14:editId="5A654156">
+            <wp:extent cx="5562600" cy="4719439"/>
+            <wp:effectExtent l="0" t="0" r="0" b="5080"/>
+            <wp:docPr id="3" name="Imagem 3"/>
+            <wp:cNvGraphicFramePr>
+              <a:graphicFrameLocks xmlns:a="http://schemas.openxmlformats.org/drawingml/2006/main" noChangeAspect="1"/>
+            </wp:cNvGraphicFramePr>
+            <a:graphic xmlns:a="http://schemas.openxmlformats.org/drawingml/2006/main">
+              <a:graphicData uri="http://schemas.openxmlformats.org/drawingml/2006/picture">
+                <pic:pic xmlns:pic="http://schemas.openxmlformats.org/drawingml/2006/picture">
+                  <pic:nvPicPr>
+                    <pic:cNvPr id="1" name=""/>
+                    <pic:cNvPicPr/>
+                  </pic:nvPicPr>
+                  <pic:blipFill>
+                    <a:blip r:embed="rId6"/>
+                    <a:stretch>
+                      <a:fillRect/>
+                    </a:stretch>
+                  </pic:blipFill>
+                  <pic:spPr>
+                    <a:xfrm>
+                      <a:off x="0" y="0"/>
+                      <a:ext cx="5567997" cy="4724018"/>
+                    </a:xfrm>
+                    <a:prstGeom prst="rect">
+                      <a:avLst/>
+                    </a:prstGeom>
+                  </pic:spPr>
+                </pic:pic>
+              </a:graphicData>
+            </a:graphic>
+          </wp:inline>
+        </w:drawing>
+      </w:r>
+      <w:r>
+        <w:t xml:space="preserve"> </w:t>
+      </w:r>
+    </w:p>
+    <w:p>
+      <w:r>
+        <w:drawing>
+          <wp:inline distT="0" distB="0" distL="0" distR="0" wp14:anchorId="6D88B38A" wp14:editId="767A9481">
+            <wp:extent cx="5800985" cy="4581525"/>
+            <wp:effectExtent l="0" t="0" r="9525" b="0"/>
+            <wp:docPr id="5" name="Imagem 5"/>
+            <wp:cNvGraphicFramePr>
+              <a:graphicFrameLocks xmlns:a="http://schemas.openxmlformats.org/drawingml/2006/main" noChangeAspect="1"/>
+            </wp:cNvGraphicFramePr>
+            <a:graphic xmlns:a="http://schemas.openxmlformats.org/drawingml/2006/main">
+              <a:graphicData uri="http://schemas.openxmlformats.org/drawingml/2006/picture">
+                <pic:pic xmlns:pic="http://schemas.openxmlformats.org/drawingml/2006/picture">
+                  <pic:nvPicPr>
+                    <pic:cNvPr id="1" name=""/>
+                    <pic:cNvPicPr/>
+                  </pic:nvPicPr>
+                  <pic:blipFill>
+                    <a:blip r:embed="rId7"/>
+                    <a:stretch>
+                      <a:fillRect/>
+                    </a:stretch>
+                  </pic:blipFill>
+                  <pic:spPr>
+                    <a:xfrm>
+                      <a:off x="0" y="0"/>
+                      <a:ext cx="5813716" cy="4591579"/>
+                    </a:xfrm>
+                    <a:prstGeom prst="rect">
+                      <a:avLst/>
+                    </a:prstGeom>
+                  </pic:spPr>
+                </pic:pic>
+              </a:graphicData>
+            </a:graphic>
+          </wp:inline>
+        </w:drawing>
+      </w:r>
+    </w:p>
+    <w:p>
       <w:pPr>
         <w:rPr>
           <w:sz w:val="32"/>
@@ -499,13 +576,11 @@
         <w:t># Autor</w:t>
       </w:r>
     </w:p>
-    <w:p/>
     <w:p>
       <w:r>
         <w:t>Juliano Santos</w:t>
       </w:r>
     </w:p>
-    <w:p/>
     <w:p>
       <w:r>
         <w:t xml:space="preserve">Projeto Integrador – Curso </w:t>

</xml_diff>